<commit_message>
fix(brand-kit): legal footer names the board member and paid-in capital
Letterhead and memo (PDF and DOCX) now carry the third legal line Croatian
business letters need: share capital paid in full, board member Tihomir Jauk.

Co-Authored-By: Claude Opus 5.5 <noreply@anthropic.com>
</commit_message>
<xml_diff>
--- a/site/public/assets/brand/kit/letterhead-a4.docx
+++ b/site/public/assets/brand/kit/letterhead-a4.docx
@@ -95,7 +95,15 @@
         <w:color w:val="55534F"/>
         <w:sz w:val="14"/>
       </w:rPr>
-      <w:t>LumiVerse d.o.o. · Markuševečka cesta 20C, 10000 Zagreb, Hrvatska · OIB 88595646800 · MBS 081511108, Trgovački sud u Zagrebu · Temeljni kapital 2.500,00 EUR</w:t>
+      <w:t>LumiVerse d.o.o. · Markuševečka cesta 20C, 10000 Zagreb, Hrvatska · OIB 88595646800 · MBS 081511108, Trgovački sud u Zagrebu</w:t>
+    </w:r>
+    <w:r>
+      <w:rPr>
+        <w:color w:val="55534F"/>
+        <w:sz w:val="14"/>
+      </w:rPr>
+      <w:br/>
+      <w:t>Temeljni kapital 2.500,00 EUR, uplaćen u cijelosti · Član uprave: Tihomir Jauk</w:t>
     </w:r>
     <w:r>
       <w:rPr>

</xml_diff>